<commit_message>
refactor(ui): update to practical dense layout with pastel blue theme
</commit_message>
<xml_diff>
--- a/reports/SEAL_Course_Project_Report.docx
+++ b/reports/SEAL_Course_Project_Report.docx
@@ -2113,7 +2113,7 @@
       <w:r>
         <w:drawing>
           <wp:inline xmlns:a="http://schemas.openxmlformats.org/drawingml/2006/main" xmlns:pic="http://schemas.openxmlformats.org/drawingml/2006/picture">
-            <wp:extent cx="5669280" cy="8766928"/>
+            <wp:extent cx="4139183" cy="6400798"/>
             <wp:docPr id="2" name="Picture 2"/>
             <wp:cNvGraphicFramePr>
               <a:graphicFrameLocks noChangeAspect="1"/>
@@ -2134,7 +2134,7 @@
                   <pic:spPr>
                     <a:xfrm>
                       <a:off x="0" y="0"/>
-                      <a:ext cx="5669280" cy="8766928"/>
+                      <a:ext cx="4139183" cy="6400798"/>
                     </a:xfrm>
                     <a:prstGeom prst="rect"/>
                   </pic:spPr>
@@ -4182,7 +4182,7 @@
       <w:r>
         <w:drawing>
           <wp:inline xmlns:a="http://schemas.openxmlformats.org/drawingml/2006/main" xmlns:pic="http://schemas.openxmlformats.org/drawingml/2006/picture">
-            <wp:extent cx="5669280" cy="12755880"/>
+            <wp:extent cx="2844799" cy="6400798"/>
             <wp:docPr id="12" name="Picture 12"/>
             <wp:cNvGraphicFramePr>
               <a:graphicFrameLocks noChangeAspect="1"/>
@@ -4203,7 +4203,7 @@
                   <pic:spPr>
                     <a:xfrm>
                       <a:off x="0" y="0"/>
-                      <a:ext cx="5669280" cy="12755880"/>
+                      <a:ext cx="2844799" cy="6400798"/>
                     </a:xfrm>
                     <a:prstGeom prst="rect"/>
                   </pic:spPr>

</xml_diff>